<commit_message>
feat(v2): support historical order backfill dates
</commit_message>
<xml_diff>
--- a/v2/templates/word/BN-Sample.docx
+++ b/v2/templates/word/BN-Sample.docx
@@ -14,58 +14,7 @@
         </w:rPr>
       </w:pPr>
       <w:r>
-        <w:rPr>
-          <w:rFonts w:ascii="Times New Roman" w:hAnsi="Times New Roman" w:cs="Times New Roman" w:hint="eastAsia"/>
-        </w:rPr>
-        <w:t>{{</w:t>
-      </w:r>
-      <w:r>
-        <w:rPr>
-          <w:rFonts w:ascii="Times New Roman" w:hAnsi="Times New Roman" w:cs="Times New Roman"/>
-        </w:rPr>
-        <w:t>pi_no</w:t>
-      </w:r>
-      <w:r>
-        <w:rPr>
-          <w:rFonts w:ascii="Times New Roman" w:hAnsi="Times New Roman" w:cs="Times New Roman" w:hint="eastAsia"/>
-        </w:rPr>
-        <w:t>}}</w:t>
-      </w:r>
-      <w:r>
-        <w:rPr>
-          <w:rFonts w:ascii="Times New Roman" w:hAnsi="Times New Roman" w:cs="Times New Roman"/>
-        </w:rPr>
-        <w:t xml:space="preserve">  </w:t>
-      </w:r>
-      <w:r>
-        <w:rPr>
-          <w:rFonts w:ascii="Times New Roman" w:hAnsi="Times New Roman" w:cs="Times New Roman" w:hint="eastAsia"/>
-        </w:rPr>
-        <w:t>{{</w:t>
-      </w:r>
-      <w:r>
-        <w:rPr>
-          <w:rFonts w:ascii="Times New Roman" w:hAnsi="Times New Roman" w:cs="Times New Roman"/>
-        </w:rPr>
-        <w:t>quantity</w:t>
-      </w:r>
-      <w:r>
-        <w:rPr>
-          <w:rFonts w:ascii="Times New Roman" w:hAnsi="Times New Roman" w:cs="Times New Roman" w:hint="eastAsia"/>
-        </w:rPr>
-        <w:t>}}</w:t>
-      </w:r>
-      <w:r>
-        <w:rPr>
-          <w:rFonts w:ascii="Times New Roman" w:hAnsi="Times New Roman" w:cs="Times New Roman"/>
-        </w:rPr>
-        <w:t xml:space="preserve"> </w:t>
-      </w:r>
-      <w:r>
-        <w:rPr>
-          <w:rFonts w:ascii="Times New Roman" w:hAnsi="Times New Roman" w:cs="Times New Roman" w:hint="eastAsia"/>
-        </w:rPr>
-        <w:t>MT</w:t>
+        <w:t>{{pi_no}}  {{quantity_with_unit}}</w:t>
       </w:r>
     </w:p>
     <w:tbl>

</xml_diff>